<commit_message>
individual report: fill in name and student ID
Rison Guan, 1675407. The student email is left as a placeholder — the one
on file here is a personal gmail, not a university address, and guessing it
on a submission document would be worse than leaving it visible.

Co-Authored-By: Claude Opus 5 <noreply@anthropic.com>
</commit_message>
<xml_diff>
--- a/compx574/Individual-Report-EN.docx
+++ b/compx574/Individual-Report-EN.docx
@@ -30,7 +30,7 @@
         <w:rPr>
           <w:rFonts w:ascii="Calibri" w:eastAsia="PingFang SC" w:hAnsi="Calibri"/>
         </w:rPr>
-        <w:t xml:space="preserve"> _[fill in]_  </w:t>
+        <w:t xml:space="preserve"> Rison Guan  </w:t>
       </w:r>
       <w:r>
         <w:rPr>
@@ -44,7 +44,7 @@
         <w:rPr>
           <w:rFonts w:ascii="Calibri" w:eastAsia="PingFang SC" w:hAnsi="Calibri"/>
         </w:rPr>
-        <w:t xml:space="preserve"> _[fill in]_  </w:t>
+        <w:t xml:space="preserve"> 1675407  </w:t>
       </w:r>
       <w:r>
         <w:rPr>
@@ -58,7 +58,7 @@
         <w:rPr>
           <w:rFonts w:ascii="Calibri" w:eastAsia="PingFang SC" w:hAnsi="Calibri"/>
         </w:rPr>
-        <w:t xml:space="preserve"> _[fill in]_ </w:t>
+        <w:t xml:space="preserve"> _[student email]_ </w:t>
       </w:r>
       <w:r>
         <w:rPr>
@@ -74,7 +74,7 @@
         </w:rPr>
         <w:t xml:space="preserve"> </w:t>
       </w:r>
-      <w:hyperlink w:history="1" r:id="rIdkpd0urmftnuem-mg2imj3">
+      <w:hyperlink w:history="1" r:id="rIdi6bowngpcsrlvthup39ki">
         <w:r>
           <w:rPr>
             <w:rStyle w:val="Hyperlink"/>
@@ -103,7 +103,7 @@
         </w:rPr>
         <w:t xml:space="preserve"> </w:t>
       </w:r>
-      <w:hyperlink w:history="1" r:id="rId5ubtu_ii2vu_zc6yvmtof">
+      <w:hyperlink w:history="1" r:id="rIdszld30ib4suzcbr3opaxi">
         <w:r>
           <w:rPr>
             <w:rStyle w:val="Hyperlink"/>
@@ -320,7 +320,7 @@
               </w:rPr>
               <w:t xml:space="preserve">Issue </w:t>
             </w:r>
-            <w:hyperlink w:history="1" r:id="rId8h3gpcmmq8--dhwnko0ox">
+            <w:hyperlink w:history="1" r:id="rIdmc_z2kt_nao2vxatqhugp">
               <w:r>
                 <w:rPr>
                   <w:rStyle w:val="Hyperlink"/>
@@ -423,7 +423,7 @@
               </w:rPr>
               <w:t xml:space="preserve">Issue </w:t>
             </w:r>
-            <w:hyperlink w:history="1" r:id="rIdr1kyvbrj7acclxskip2ep">
+            <w:hyperlink w:history="1" r:id="rIdvitdjgiwq3swb4ysfypov">
               <w:r>
                 <w:rPr>
                   <w:rStyle w:val="Hyperlink"/>
@@ -526,7 +526,7 @@
               </w:rPr>
               <w:t xml:space="preserve">PR </w:t>
             </w:r>
-            <w:hyperlink w:history="1" r:id="rIdfq63agp-bvtripwxnkkcu">
+            <w:hyperlink w:history="1" r:id="rIdtk8vcxckhh1wnrdu9bcle">
               <w:r>
                 <w:rPr>
                   <w:rStyle w:val="Hyperlink"/>
@@ -637,7 +637,7 @@
               </w:rPr>
               <w:t xml:space="preserve">PR </w:t>
             </w:r>
-            <w:hyperlink w:history="1" r:id="rIdotd91pdyxig6rgyo1auwu">
+            <w:hyperlink w:history="1" r:id="rIddedzf70iecjh-edidg1u8">
               <w:r>
                 <w:rPr>
                   <w:rStyle w:val="Hyperlink"/>
@@ -834,7 +834,7 @@
               </w:rPr>
               <w:t xml:space="preserve">PR </w:t>
             </w:r>
-            <w:hyperlink w:history="1" r:id="rIdlqwxzgyqxjebcabzzekz_">
+            <w:hyperlink w:history="1" r:id="rIdbqffghxnc3h38dac1ik8b">
               <w:r>
                 <w:rPr>
                   <w:rStyle w:val="Hyperlink"/>
@@ -916,7 +916,7 @@
       <w:pPr>
         <w:spacing w:after="120" w:before="60"/>
       </w:pPr>
-      <w:hyperlink w:history="1" r:id="rIdzpuklnuy_6mnflphnk6x3">
+      <w:hyperlink w:history="1" r:id="rIdpnho2-kmeyxvawj8gk_yh">
         <w:r>
           <w:rPr>
             <w:rStyle w:val="Hyperlink"/>
@@ -1142,7 +1142,7 @@
       <w:pPr>
         <w:spacing w:after="120" w:before="60"/>
       </w:pPr>
-      <w:hyperlink w:history="1" r:id="rIdoeesi7ticrs3uozzasiht">
+      <w:hyperlink w:history="1" r:id="rIdhi9ion8ljjhw33lkacp1w">
         <w:r>
           <w:rPr>
             <w:rStyle w:val="Hyperlink"/>
@@ -1157,7 +1157,7 @@
         </w:rPr>
         <w:t xml:space="preserve"> · opened 2026-09-21 · 1 commit, +16/−0, 2 files · fixes existing issue </w:t>
       </w:r>
-      <w:hyperlink w:history="1" r:id="rId9uv0whkiszfcpknjluhow">
+      <w:hyperlink w:history="1" r:id="rId82dotet56myfblwkcjsti">
         <w:r>
           <w:rPr>
             <w:rStyle w:val="Hyperlink"/>
@@ -1506,7 +1506,7 @@
               <w:spacing w:after="0" w:before="0"/>
               <w:jc w:val="left"/>
             </w:pPr>
-            <w:hyperlink w:history="1" r:id="rIdqgt0yxwbuwohs83thxqyo">
+            <w:hyperlink w:history="1" r:id="rIdrnm0pp4xfslewdw-isewb">
               <w:r>
                 <w:rPr>
                   <w:rStyle w:val="Hyperlink"/>
@@ -1575,7 +1575,7 @@
               </w:rPr>
               <w:t xml:space="preserve">, PR </w:t>
             </w:r>
-            <w:hyperlink w:history="1" r:id="rIdnkpz_f6gieme7ty5dcxqg">
+            <w:hyperlink w:history="1" r:id="rId508sw89lvkmjmyeibgera">
               <w:r>
                 <w:rPr>
                   <w:rStyle w:val="Hyperlink"/>
@@ -1609,7 +1609,7 @@
               <w:spacing w:after="0" w:before="0"/>
               <w:jc w:val="left"/>
             </w:pPr>
-            <w:hyperlink w:history="1" r:id="rIdfjbqddaxawqnduxmpvifb">
+            <w:hyperlink w:history="1" r:id="rIdeuaqzagpjrcv187htqftz">
               <w:r>
                 <w:rPr>
                   <w:rStyle w:val="Hyperlink"/>
@@ -1692,7 +1692,7 @@
               </w:rPr>
               <w:t xml:space="preserve">, PR </w:t>
             </w:r>
-            <w:hyperlink w:history="1" r:id="rIdahihrpxxcejs4a8jpnha2">
+            <w:hyperlink w:history="1" r:id="rIdfpspcp-m2i8gdk_fm8cde">
               <w:r>
                 <w:rPr>
                   <w:rStyle w:val="Hyperlink"/>
@@ -2461,7 +2461,7 @@
         </w:rPr>
         <w:t xml:space="preserve"> (PR </w:t>
       </w:r>
-      <w:hyperlink w:history="1" r:id="rIdekjavm46gpm9vzenmdlub">
+      <w:hyperlink w:history="1" r:id="rIdzkc_wlgurctas3adytsuk">
         <w:r>
           <w:rPr>
             <w:rStyle w:val="Hyperlink"/>

</xml_diff>